<commit_message>
docs: emails attach the flagship PDF (not a repo file); regenerate Word doc
Emails now say 'I've attached the paper (Mitchell's Principle of Constraint-First Unification)'
instead of pointing at a repo markdown file; the Word doc is regenerated to match, with the
attach note up top.
</commit_message>
<xml_diff>
--- a/outreach-emails.docx
+++ b/outreach-emails.docx
@@ -15,7 +15,7 @@
         <w:rPr>
           <w:i/>
         </w:rPr>
-        <w:t>Ready to send. Updated 2026-10-23 with the corrected result and the expanded list.</w:t>
+        <w:t>Ready to send. Attach paper/mitchells-principle.pdf (the flagship). Updated 2026-10-23.</w:t>
       </w:r>
     </w:p>
     <w:p>
@@ -28,9 +28,6 @@
     </w:p>
     <w:p>
       <w:r>
-        <w:rPr>
-          <w:b w:val="0"/>
-        </w:rPr>
         <w:t>Send the four ready emails first (A–D), one at a time. The other nine are strong next candidates; look up their emails when you get there.</w:t>
       </w:r>
     </w:p>
@@ -499,7 +496,7 @@
         <w:t>Everything is reproducible: github.com/robmitchellengineering-hub/pacland</w:t>
         <w:br/>
         <w:br/>
-        <w:t>If you have ten minutes to look at the short statement (docs/constraint-first-theorem.md in that repo), I'd be grateful for a yes/no on whether it's sound. If it holds, an arXiv endorsement would mean a great deal — but a comment on the correctness is what I'm really asking for.</w:t>
+        <w:t>I've attached the paper (Mitchell's Principle of Constraint-First Unification). If you have ten minutes to look it over, I'd be grateful for a yes/no on whether it's sound. If it holds, an arXiv endorsement would mean a great deal — but a comment on the correctness is what I'm really asking for.</w:t>
         <w:br/>
         <w:br/>
         <w:t>Thank you for your time,</w:t>
@@ -536,7 +533,7 @@
         <w:t>Everything is reproducible: github.com/robmitchellengineering-hub/pacland</w:t>
         <w:br/>
         <w:br/>
-        <w:t>If you have ten minutes to look at the short statement (docs/constraint-first-theorem.md), I'd be grateful for a yes/no on whether it's sound. If it holds, an arXiv endorsement would mean a great deal — but a comment on the correctness is what I'm really asking for.</w:t>
+        <w:t>I've attached the paper (Mitchell's Principle of Constraint-First Unification). If you have ten minutes to look it over, I'd be grateful for a yes/no on whether it's sound. If it holds, an arXiv endorsement would mean a great deal — but a comment on the correctness is what I'm really asking for.</w:t>
         <w:br/>
         <w:br/>
         <w:t>Thank you for your time,</w:t>
@@ -573,7 +570,7 @@
         <w:t>Everything is reproducible: github.com/robmitchellengineering-hub/pacland</w:t>
         <w:br/>
         <w:br/>
-        <w:t>If you have ten minutes to look at the short statement (docs/constraint-first-theorem.md), I'd be grateful for a yes/no on whether it's sound. If it holds, an arXiv endorsement would mean a great deal — but a comment on the correctness is what I'm really asking for.</w:t>
+        <w:t>I've attached the paper (Mitchell's Principle of Constraint-First Unification). If you have ten minutes to look it over, I'd be grateful for a yes/no on whether it's sound. If it holds, an arXiv endorsement would mean a great deal — but a comment on the correctness is what I'm really asking for.</w:t>
         <w:br/>
         <w:br/>
         <w:t>Thank you for your time,</w:t>
@@ -610,7 +607,7 @@
         <w:t>Everything is reproducible: github.com/robmitchellengineering-hub/pacland</w:t>
         <w:br/>
         <w:br/>
-        <w:t>If you have ten minutes to look at the short statement (docs/constraint-first-theorem.md), I'd be grateful for a yes/no on whether it's sound. If it holds, an arXiv endorsement would mean a great deal — but a comment on the correctness is what I'm really asking for.</w:t>
+        <w:t>I've attached the paper (Mitchell's Principle of Constraint-First Unification). If you have ten minutes to look it over, I'd be grateful for a yes/no on whether it's sound. If it holds, an arXiv endorsement would mean a great deal — but a comment on the correctness is what I'm really asking for.</w:t>
         <w:br/>
         <w:br/>
         <w:t>Thank you for your time,</w:t>
@@ -628,9 +625,6 @@
     </w:p>
     <w:p>
       <w:r>
-        <w:rPr>
-          <w:b w:val="0"/>
-        </w:rPr>
         <w:t>Send A → B → C → D, one at a time, a couple of days apart. Do not mass-BCC. If the first two bounce or go silent, that's normal — it's a numbers game with a checkable artifact behind it. Keep a note of any reply, even "interesting, but not for me" — that person may still point to the right endorser.</w:t>
       </w:r>
     </w:p>
@@ -644,9 +638,6 @@
     </w:p>
     <w:p>
       <w:r>
-        <w:rPr>
-          <w:b w:val="0"/>
-        </w:rPr>
         <w:t>These are for reach, not endorsement — send only after the paper is live on arXiv so there is a citable link.</w:t>
       </w:r>
     </w:p>

</xml_diff>